<commit_message>
fix: enforce global zero-parentheses policy across all resumes and remove escalation ladder jargon
</commit_message>
<xml_diff>
--- a/output/BSI_AI_Technical_Specialist/Ebenezer_Rolston_BSI_AI_Technical_Specialist_Resume.docx
+++ b/output/BSI_AI_Technical_Specialist/Ebenezer_Rolston_BSI_AI_Technical_Specialist_Resume.docx
@@ -902,6 +902,34 @@
           <w:color w:val="1F1F1F"/>
           <w:sz w:val="18"/>
         </w:rPr>
+        <w:t xml:space="preserve">OpenAI Codex:</w:t>
+      </w:r>
+      <w:r>
+        <w:rPr>
+          <w:color w:val="1F1F1F"/>
+          <w:sz w:val="18"/>
+        </w:rPr>
+        <w:t xml:space="preserve"> Agent Orchestration • MCP Integration • Context Engineering — Completed 7 intensive bootcamps across Fundamentals, Codex 201, and Codex 301 covering Plan Mode, parallel worktrees, runtime hooks, and automated build–test–fix loops</w:t>
+      </w:r>
+    </w:p>
+    <w:p>
+      <w:pPr>
+        <w:spacing w:before="0" w:after="20" w:line="240" w:lineRule="auto"/>
+        <w:ind w:left="360" w:hanging="180"/>
+      </w:pPr>
+      <w:r>
+        <w:rPr>
+          <w:color w:val="1F1F1F"/>
+          <w:sz w:val="20"/>
+        </w:rPr>
+        <w:t xml:space="preserve">• </w:t>
+      </w:r>
+      <w:r>
+        <w:rPr>
+          <w:b/>
+          <w:color w:val="1F1F1F"/>
+          <w:sz w:val="18"/>
+        </w:rPr>
         <w:t xml:space="preserve">Packt Certificate Course:</w:t>
       </w:r>
       <w:r>
@@ -909,7 +937,7 @@
           <w:color w:val="1F1F1F"/>
           <w:sz w:val="18"/>
         </w:rPr>
-        <w:t xml:space="preserve"> Agentic AI for Finance — Nicole Koenigstein — Harness Engineering, Multi-Agent Topologies, Trajectory Observability, OWASP Agent Vulnerabilities, Structured Output Validation</w:t>
+        <w:t xml:space="preserve"> Agentic AI for Finance — Nicole Koenigstein — Harness Engineering • Multi-Agent Topologies • Trajectory Observability • OWASP Agent Vulnerabilities • Structured Output Validation</w:t>
       </w:r>
     </w:p>
     <w:p>
@@ -1206,7 +1234,7 @@
           <w:color w:val="1F1F1F"/>
           <w:sz w:val="18"/>
         </w:rPr>
-        <w:t xml:space="preserve"> 4-Layer Harness Architecture • Trajectory Observability &amp; 6-Dimension Scorecard • OpenTelemetry GenAI Semantic Conventions • Langfuse &amp; LangSmith Tracing • OWASP Top 15 Agent Vulnerability Assessment • Confused Deputy &amp; Privilege Escalation Defense • 3-Tier Structured Output Validation • Loop Engineering &amp; Termination Condition Verification • Escalation Ladder Assessment</w:t>
+        <w:t xml:space="preserve"> 4-Layer Harness Architecture • Trajectory Observability &amp; 6-Dimension Scorecard • OpenTelemetry GenAI Semantic Conventions • Langfuse &amp; LangSmith Tracing • OWASP Top 15 Agent Vulnerability Assessment • Confused Deputy &amp; Privilege Escalation Defense • 3-Tier Structured Output Validation • Loop Engineering &amp; Bounded Execution Verification</w:t>
       </w:r>
     </w:p>
     <w:p>
@@ -1290,7 +1318,7 @@
           <w:color w:val="1F1F1F"/>
           <w:sz w:val="18"/>
         </w:rPr>
-        <w:t xml:space="preserve"> Python — Pandas, NumPy, Scikit-Learn • Pydantic Contract Enforcement • FastAPI • LangGraph StateGraph — FSM/HSM • Docker &amp; E2B Sandboxing • REST API &amp; JSON Schema • Git &amp; GitHub • Relational SQL</w:t>
+        <w:t xml:space="preserve"> Python — Pandas, NumPy, Scikit-Learn • Pydantic Contract Enforcement • FastAPI • LangGraph StateGraph FSM and HSM • Docker &amp; E2B Sandboxing • REST API &amp; JSON Schema • Git &amp; GitHub • Relational SQL</w:t>
       </w:r>
     </w:p>
     <w:p>

</xml_diff>